<commit_message>
I have completed the Volume 2 and Volume 3 for the FF so i have also observed the patterns from the HF i have observed .
</commit_message>
<xml_diff>
--- a/atlas/Human-Frictions/Files-and-Project-Management/FF Volume 01 (FF-001–FF-025).docx
+++ b/atlas/Human-Frictions/Files-and-Project-Management/FF Volume 01 (FF-001–FF-025).docx
@@ -132,7 +132,13 @@
     </w:p>
     <w:p>
       <w:r>
-        <w:t>26 July 2026</w:t>
+        <w:t>2</w:t>
+      </w:r>
+      <w:r>
+        <w:t>8</w:t>
+      </w:r>
+      <w:r>
+        <w:t xml:space="preserve"> July 2026</w:t>
       </w:r>
     </w:p>
     <w:p/>

</xml_diff>